<commit_message>
Change cabinet of vntr
</commit_message>
<xml_diff>
--- a/scripts/print_forms/certificate_ibp_2025(n).docx
+++ b/scripts/print_forms/certificate_ibp_2025(n).docx
@@ -296,35 +296,27 @@
                               <w:spacing w:before="0" w:beforeAutospacing="0" w:after="0" w:afterAutospacing="0"/>
                               <w:rPr>
                                 <w:rFonts w:ascii="IBM Plex Sans" w:hAnsi="IBM Plex Sans"/>
-                                <w:sz w:val="28"/>
-                                <w:szCs w:val="28"/>
-                                <w:lang w:val="en-US"/>
-                              </w:rPr>
-                            </w:pPr>
-                            <w:r>
-                              <w:rPr>
-                                <w:rFonts w:ascii="IBM Plex Sans" w:hAnsi="IBM Plex Sans"/>
                                 <w:bCs/>
                                 <w:sz w:val="28"/>
-                              </w:rPr>
-                              <w:t>для</w:t>
-                            </w:r>
+                                <w:lang w:val="en-US"/>
+                              </w:rPr>
+                            </w:pPr>
                             <w:r>
                               <w:rPr>
                                 <w:rFonts w:ascii="IBM Plex Sans" w:hAnsi="IBM Plex Sans"/>
                                 <w:bCs/>
                                 <w:sz w:val="28"/>
-                                <w:lang w:val="en-US"/>
-                              </w:rPr>
-                              <w:t xml:space="preserve"> </w:t>
+                              </w:rPr>
+                              <w:t>для</w:t>
                             </w:r>
                             <w:r>
                               <w:rPr>
                                 <w:rFonts w:ascii="IBM Plex Sans" w:hAnsi="IBM Plex Sans"/>
                                 <w:bCs/>
                                 <w:sz w:val="28"/>
-                              </w:rPr>
-                              <w:t>сотрудник</w:t>
+                                <w:lang w:val="en-US"/>
+                              </w:rPr>
+                              <w:t xml:space="preserve"> </w:t>
                             </w:r>
                             <w:r>
                               <w:rPr>
@@ -332,16 +324,15 @@
                                 <w:bCs/>
                                 <w:sz w:val="28"/>
                               </w:rPr>
-                              <w:t>ов</w:t>
+                              <w:t xml:space="preserve">обучения </w:t>
                             </w:r>
                             <w:r>
                               <w:rPr>
                                 <w:rFonts w:ascii="IBM Plex Sans" w:hAnsi="IBM Plex Sans"/>
                                 <w:bCs/>
                                 <w:sz w:val="28"/>
-                                <w:lang w:val="en-US"/>
-                              </w:rPr>
-                              <w:t xml:space="preserve"> </w:t>
+                              </w:rPr>
+                              <w:t>сотрудник</w:t>
                             </w:r>
                             <w:r>
                               <w:rPr>
@@ -349,7 +340,7 @@
                                 <w:bCs/>
                                 <w:sz w:val="28"/>
                               </w:rPr>
-                              <w:t>предприятия</w:t>
+                              <w:t>ов</w:t>
                             </w:r>
                             <w:r>
                               <w:rPr>
@@ -360,7 +351,27 @@
                               </w:rPr>
                               <w:t xml:space="preserve"> </w:t>
                             </w:r>
-                            <w:bookmarkStart w:id="2" w:name="org_name"/>
+                            <w:r>
+                              <w:rPr>
+                                <w:rFonts w:ascii="IBM Plex Sans" w:hAnsi="IBM Plex Sans"/>
+                                <w:bCs/>
+                                <w:sz w:val="28"/>
+                              </w:rPr>
+                              <w:t>предприятия</w:t>
+                            </w:r>
+                          </w:p>
+                          <w:p>
+                            <w:pPr>
+                              <w:pStyle w:val="a9"/>
+                              <w:spacing w:before="0" w:beforeAutospacing="0" w:after="0" w:afterAutospacing="0"/>
+                              <w:rPr>
+                                <w:rFonts w:ascii="IBM Plex Sans" w:hAnsi="IBM Plex Sans"/>
+                                <w:bCs/>
+                                <w:sz w:val="28"/>
+                                <w:lang w:val="en-US"/>
+                              </w:rPr>
+                            </w:pPr>
+                            <w:bookmarkStart w:id="2" w:name="org_id"/>
                             <w:r>
                               <w:rPr>
                                 <w:rFonts w:ascii="IBM Plex Sans" w:hAnsi="IBM Plex Sans"/>
@@ -388,6 +399,7 @@
                               </w:rPr>
                               <w:t>TopElem.custom_elems.ObtainChildByKey("</w:t>
                             </w:r>
+                            <w:proofErr w:type="spellStart"/>
                             <w:r>
                               <w:rPr>
                                 <w:rFonts w:ascii="IBM Plex Sans" w:hAnsi="IBM Plex Sans"/>
@@ -397,6 +409,7 @@
                               </w:rPr>
                               <w:t>org_name</w:t>
                             </w:r>
+                            <w:proofErr w:type="spellEnd"/>
                             <w:r>
                               <w:rPr>
                                 <w:rFonts w:ascii="IBM Plex Sans" w:hAnsi="IBM Plex Sans"/>
@@ -539,35 +552,27 @@
                         <w:spacing w:before="0" w:beforeAutospacing="0" w:after="0" w:afterAutospacing="0"/>
                         <w:rPr>
                           <w:rFonts w:ascii="IBM Plex Sans" w:hAnsi="IBM Plex Sans"/>
-                          <w:sz w:val="28"/>
-                          <w:szCs w:val="28"/>
-                          <w:lang w:val="en-US"/>
-                        </w:rPr>
-                      </w:pPr>
-                      <w:r>
-                        <w:rPr>
-                          <w:rFonts w:ascii="IBM Plex Sans" w:hAnsi="IBM Plex Sans"/>
                           <w:bCs/>
                           <w:sz w:val="28"/>
-                        </w:rPr>
-                        <w:t>для</w:t>
-                      </w:r>
+                          <w:lang w:val="en-US"/>
+                        </w:rPr>
+                      </w:pPr>
                       <w:r>
                         <w:rPr>
                           <w:rFonts w:ascii="IBM Plex Sans" w:hAnsi="IBM Plex Sans"/>
                           <w:bCs/>
                           <w:sz w:val="28"/>
-                          <w:lang w:val="en-US"/>
-                        </w:rPr>
-                        <w:t xml:space="preserve"> </w:t>
+                        </w:rPr>
+                        <w:t>для</w:t>
                       </w:r>
                       <w:r>
                         <w:rPr>
                           <w:rFonts w:ascii="IBM Plex Sans" w:hAnsi="IBM Plex Sans"/>
                           <w:bCs/>
                           <w:sz w:val="28"/>
-                        </w:rPr>
-                        <w:t>сотрудник</w:t>
+                          <w:lang w:val="en-US"/>
+                        </w:rPr>
+                        <w:t xml:space="preserve"> </w:t>
                       </w:r>
                       <w:r>
                         <w:rPr>
@@ -575,16 +580,15 @@
                           <w:bCs/>
                           <w:sz w:val="28"/>
                         </w:rPr>
-                        <w:t>ов</w:t>
+                        <w:t xml:space="preserve">обучения </w:t>
                       </w:r>
                       <w:r>
                         <w:rPr>
                           <w:rFonts w:ascii="IBM Plex Sans" w:hAnsi="IBM Plex Sans"/>
                           <w:bCs/>
                           <w:sz w:val="28"/>
-                          <w:lang w:val="en-US"/>
-                        </w:rPr>
-                        <w:t xml:space="preserve"> </w:t>
+                        </w:rPr>
+                        <w:t>сотрудник</w:t>
                       </w:r>
                       <w:r>
                         <w:rPr>
@@ -592,7 +596,7 @@
                           <w:bCs/>
                           <w:sz w:val="28"/>
                         </w:rPr>
-                        <w:t>предприятия</w:t>
+                        <w:t>ов</w:t>
                       </w:r>
                       <w:r>
                         <w:rPr>
@@ -603,7 +607,27 @@
                         </w:rPr>
                         <w:t xml:space="preserve"> </w:t>
                       </w:r>
-                      <w:bookmarkStart w:id="4" w:name="org_name"/>
+                      <w:r>
+                        <w:rPr>
+                          <w:rFonts w:ascii="IBM Plex Sans" w:hAnsi="IBM Plex Sans"/>
+                          <w:bCs/>
+                          <w:sz w:val="28"/>
+                        </w:rPr>
+                        <w:t>предприятия</w:t>
+                      </w:r>
+                    </w:p>
+                    <w:p>
+                      <w:pPr>
+                        <w:pStyle w:val="a9"/>
+                        <w:spacing w:before="0" w:beforeAutospacing="0" w:after="0" w:afterAutospacing="0"/>
+                        <w:rPr>
+                          <w:rFonts w:ascii="IBM Plex Sans" w:hAnsi="IBM Plex Sans"/>
+                          <w:bCs/>
+                          <w:sz w:val="28"/>
+                          <w:lang w:val="en-US"/>
+                        </w:rPr>
+                      </w:pPr>
+                      <w:bookmarkStart w:id="4" w:name="org_id"/>
                       <w:r>
                         <w:rPr>
                           <w:rFonts w:ascii="IBM Plex Sans" w:hAnsi="IBM Plex Sans"/>
@@ -631,6 +655,7 @@
                         </w:rPr>
                         <w:t>TopElem.custom_elems.ObtainChildByKey("</w:t>
                       </w:r>
+                      <w:proofErr w:type="spellStart"/>
                       <w:r>
                         <w:rPr>
                           <w:rFonts w:ascii="IBM Plex Sans" w:hAnsi="IBM Plex Sans"/>
@@ -640,6 +665,7 @@
                         </w:rPr>
                         <w:t>org_name</w:t>
                       </w:r>
+                      <w:proofErr w:type="spellEnd"/>
                       <w:r>
                         <w:rPr>
                           <w:rFonts w:ascii="IBM Plex Sans" w:hAnsi="IBM Plex Sans"/>
@@ -1360,9 +1386,21 @@
                                 <w:szCs w:val="52"/>
                                 <w:lang w:val="en-US"/>
                               </w:rPr>
-                              <w:t>==TopElem.person_fullname</w:t>
+                              <w:t>==</w:t>
+                            </w:r>
+                            <w:proofErr w:type="spellStart"/>
+                            <w:r>
+                              <w:rPr>
+                                <w:rFonts w:ascii="IBM Plex Sans" w:hAnsi="IBM Plex Sans" w:cs="Times New Roman"/>
+                                <w:b/>
+                                <w:sz w:val="52"/>
+                                <w:szCs w:val="52"/>
+                                <w:lang w:val="en-US"/>
+                              </w:rPr>
+                              <w:t>TopElem.person_fullname</w:t>
                             </w:r>
                             <w:bookmarkEnd w:id="5"/>
+                            <w:proofErr w:type="spellEnd"/>
                           </w:p>
                         </w:txbxContent>
                       </wps:txbx>
@@ -1493,6 +1531,7 @@
                               </w:rPr>
                               <w:t>==</w:t>
                             </w:r>
+                            <w:proofErr w:type="spellStart"/>
                             <w:r>
                               <w:rPr>
                                 <w:rFonts w:ascii="IBM Plex Sans" w:hAnsi="IBM Plex Sans" w:cs="Times New Roman"/>
@@ -1500,8 +1539,9 @@
                                 <w:szCs w:val="20"/>
                                 <w:lang w:val="en-US"/>
                               </w:rPr>
-                              <w:t xml:space="preserve">StrDate </w:t>
-                            </w:r>
+                              <w:t>StrDate</w:t>
+                            </w:r>
+                            <w:proofErr w:type="spellEnd"/>
                             <w:r>
                               <w:rPr>
                                 <w:rFonts w:ascii="IBM Plex Sans" w:hAnsi="IBM Plex Sans" w:cs="Times New Roman"/>
@@ -1509,7 +1549,7 @@
                                 <w:szCs w:val="20"/>
                                 <w:lang w:val="en-US"/>
                               </w:rPr>
-                              <w:t>(</w:t>
+                              <w:t xml:space="preserve"> </w:t>
                             </w:r>
                             <w:r>
                               <w:rPr>
@@ -1518,8 +1558,19 @@
                                 <w:szCs w:val="20"/>
                                 <w:lang w:val="en-US"/>
                               </w:rPr>
+                              <w:t>(</w:t>
+                            </w:r>
+                            <w:proofErr w:type="spellStart"/>
+                            <w:r>
+                              <w:rPr>
+                                <w:rFonts w:ascii="IBM Plex Sans" w:hAnsi="IBM Plex Sans" w:cs="Times New Roman"/>
+                                <w:sz w:val="20"/>
+                                <w:szCs w:val="20"/>
+                                <w:lang w:val="en-US"/>
+                              </w:rPr>
                               <w:t>TopElem.delivery_date,false,false</w:t>
                             </w:r>
+                            <w:proofErr w:type="spellEnd"/>
                             <w:r>
                               <w:rPr>
                                 <w:rFonts w:ascii="IBM Plex Sans" w:hAnsi="IBM Plex Sans" w:cs="Times New Roman"/>

</xml_diff>